<commit_message>
Fix bugs with cnf gathered (bitwise addition of cell and row cnf is an mistake)
</commit_message>
<xml_diff>
--- a/tests/examples/grid.docx
+++ b/tests/examples/grid.docx
@@ -9,10 +9,10 @@
         <w:tblLook w:val="01E0" w:firstRow="1" w:lastRow="1" w:firstColumn="1" w:lastColumn="1" w:noHBand="0" w:noVBand="0"/>
       </w:tblPr>
       <w:tblGrid>
-        <w:gridCol w:w="2354"/>
-        <w:gridCol w:w="2298"/>
-        <w:gridCol w:w="2283"/>
-        <w:gridCol w:w="2370"/>
+        <w:gridCol w:w="2326"/>
+        <w:gridCol w:w="2326"/>
+        <w:gridCol w:w="2326"/>
+        <w:gridCol w:w="2327"/>
       </w:tblGrid>
       <w:tr>
         <w:tc>
@@ -20,7 +20,9 @@
             <w:cnfStyle w:val="000010000000" w:firstRow="0" w:lastRow="0" w:firstColumn="0" w:lastColumn="0" w:oddVBand="1" w:evenVBand="0" w:oddHBand="0" w:evenHBand="0" w:firstRowFirstColumn="0" w:firstRowLastColumn="0" w:lastRowFirstColumn="0" w:lastRowLastColumn="0"/>
             <w:tcW w:w="2336" w:type="dxa"/>
           </w:tcPr>
-          <w:p/>
+          <w:p>
+            <w:bookmarkStart w:id="0" w:name="_GoBack"/>
+          </w:p>
         </w:tc>
         <w:tc>
           <w:tcPr>
@@ -130,11 +132,9 @@
           <w:p/>
         </w:tc>
       </w:tr>
+      <w:bookmarkEnd w:id="0"/>
     </w:tbl>
-    <w:p>
-      <w:bookmarkStart w:id="0" w:name="_GoBack"/>
-      <w:bookmarkEnd w:id="0"/>
-    </w:p>
+    <w:p/>
     <w:sectPr>
       <w:pgSz w:w="11906" w:h="16838"/>
       <w:pgMar w:top="1134" w:right="850" w:bottom="1134" w:left="1701" w:header="708" w:footer="708" w:gutter="0"/>
@@ -598,14 +598,13 @@
     <w:name w:val="Scary"/>
     <w:basedOn w:val="a1"/>
     <w:uiPriority w:val="99"/>
-    <w:rsid w:val="0046481B"/>
+    <w:rsid w:val="00DD3349"/>
     <w:pPr>
       <w:spacing w:after="0" w:line="240" w:lineRule="auto"/>
     </w:pPr>
     <w:tblPr>
       <w:tblStyleRowBandSize w:val="1"/>
       <w:tblStyleColBandSize w:val="1"/>
-      <w:tblCellSpacing w:w="71" w:type="dxa"/>
       <w:tblBorders>
         <w:top w:val="single" w:sz="4" w:space="0" w:color="auto"/>
         <w:left w:val="single" w:sz="4" w:space="0" w:color="auto"/>
@@ -615,9 +614,6 @@
         <w:insideV w:val="single" w:sz="4" w:space="0" w:color="auto"/>
       </w:tblBorders>
     </w:tblPr>
-    <w:trPr>
-      <w:tblCellSpacing w:w="71" w:type="dxa"/>
-    </w:trPr>
     <w:tblStylePr w:type="band1Vert">
       <w:tblPr/>
       <w:tcPr>

</xml_diff>